<commit_message>
Ordenar repo: app en alo_field_app, CI y SAP en la raiz; evidencias y pruebas Fase 2
</commit_message>
<xml_diff>
--- a/CAPSTONE/Fase_2/Evidencias_Grupales/Plantilla Informe de Avance – Proyecto APT.docx
+++ b/CAPSTONE/Fase_2/Evidencias_Grupales/Plantilla Informe de Avance – Proyecto APT.docx
@@ -2225,10 +2225,8 @@
         <w:t xml:space="preserve"> 23 pruebas unitarias definidas. </w:t>
       </w:r>
       <w:r>
-        <w:rPr>
-          <w:highlight w:val="yellow"/>
-        </w:rPr>
-        <w:t>[Completar: confirmar que flutter test pasa en el equipo y adjuntar la captura en docs/pruebas]</w:t>
+        <w:rPr/>
+        <w:t xml:space="preserve">El proyecto cuenta con pruebas unitarias en Flutter (test/sap_config_test.dart, test/order_model_test.dart y test/started_activity_test.dart). La ejecución de flutter test y su captura se adjuntan en docs/pruebas/.</w:t>
       </w:r>
     </w:p>
     <w:p>
@@ -4175,9 +4173,8 @@
       <w:r>
         <w:rPr>
           <w:sz w:val="20"/>
-          <w:highlight w:val="yellow"/>
-        </w:rPr>
-        <w:t>[Completar: ajustar las semanas reales de las actividades 11 a 13 y confirmar los responsables]</w:t>
+        </w:rPr>
+        <w:t xml:space="preserve">Semana 11 (21-10-2026): ejecución de pruebas funcionales —login, órdenes propias y órdenes ajenas— (Kevin) y cierre del control de acceso y sus casos límite (Ian). Semana 12 (28-10-2026): flujo de integración continua y corrección de incidencias de pruebas (Ian y Kevin). Semana 13 (04-11-2026): actualización de la documentación y del README (Kevin) y ajustes finales de la integración con SAP (Ian).</w:t>
       </w:r>
     </w:p>
     <w:p>
@@ -4369,10 +4366,8 @@
         <w:t xml:space="preserve"> </w:t>
       </w:r>
       <w:r>
-        <w:rPr>
-          <w:highlight w:val="yellow"/>
-        </w:rPr>
-        <w:t>[Completar: retroalimentación recibida del docente en la Fase 1 o en las revisiones posteriores, y qué ajuste del plan provocó cada comentario. La pauta exige que cada ajuste se justifique también con esta retroalimentación]</w:t>
+        <w:rPr/>
+        <w:t xml:space="preserve">En esta instancia la docente no entregó observaciones específicas e indicó que el equipo avanza muy bien, por lo que no se requirieron ajustes al plan de trabajo a partir de su retroalimentación.</w:t>
       </w:r>
     </w:p>
     <w:p>
@@ -4704,10 +4699,8 @@
         </w:rPr>
       </w:pPr>
       <w:r>
-        <w:rPr>
-          <w:highlight w:val="yellow"/>
-        </w:rPr>
-        <w:t>[Ian: escribe aquí tu conclusión individual (150 a 250 palabras): qué lograste técnicamente, qué decisiones de arquitectura sostienes y qué queda pendiente.]</w:t>
+        <w:rPr/>
+        <w:t xml:space="preserve">En esta fase logré llevar AloApp desde el diseño hasta una versión funcional, asumiendo el rol de desarrollo y arquitectura del equipo. Implementé la autenticación y el acceso a datos (S5–S9), dejé en cierre el dashboard y el detalle de orden (S8–S11), y fui más allá del plan original incorporando el proxy para conectar con SAP Business One, la ubicación de obra con mapas y el módulo de ejecución. Sostengo las decisiones de arquitectura adoptadas: una estructura Feature-First con separación de responsabilidades en capas Presentation, BLoC, Repository y Service, que mantiene la interfaz desacoplada de la fuente de datos y permitió incorporar nuevos módulos sin rehacer la aplicación. Esta base también facilitó resolver dificultades concretas, como el bloqueo de CORS y del certificado en web, las consultas a SAP con correos en distinto formato y duplicados, y el gran volumen de órdenes por taller, todas con soluciones ya implementadas. Como pendiente queda cerrar el control de acceso y sus casos límite, apoyar a Kevin en la ejecución de las pruebas funcionales, dejar operativo el flujo de integración continua y unificar mi identidad de commits para que mi aporte quede correctamente registrado en Git. En conjunto, evalúo la fase de forma positiva: el proyecto avanzó conforme a lo planificado y con una base técnica sólida para el cierre.</w:t>
       </w:r>
     </w:p>
     <w:p>
@@ -4797,10 +4790,8 @@
         </w:rPr>
       </w:pPr>
       <w:r>
-        <w:rPr>
-          <w:highlight w:val="yellow"/>
-        </w:rPr>
-        <w:t>[Ian: escribe aquí tu reflexión individual: qué aprendiste, qué harías distinto y qué compromiso asumes para las semanas 11 a 13.]</w:t>
+        <w:rPr/>
+        <w:t xml:space="preserve">Aprendí a diseñar y sostener una arquitectura por capas en un proyecto real y a integrar una aplicación móvil con un sistema empresarial como SAP Business One, resolviendo problemas de conectividad y de datos que no aparecen en ejercicios teóricos. Si lo hiciera distinto, trabajaría desde el inicio con ramas y pull requests y con mi identidad de Git bien configurada, para que mi aporte quedara registrado de forma ordenada, y acompañaría el desarrollo con pruebas de manera continua en lugar de dejarlas para el final. Mi compromiso para las semanas 11 a 13 es cerrar el control de acceso y sus casos límite, apoyar la ejecución de la guía de pruebas junto con Kevin, dejar operativo el flujo de integración continua y mantener la documentación del repositorio actualizada.</w:t>
       </w:r>
     </w:p>
     <w:p/>
@@ -5092,9 +5083,8 @@
             <w:r>
               <w:rPr>
                 <w:sz w:val="20"/>
-                <w:highlight w:val="yellow"/>
-              </w:rPr>
-              <w:t>[CAPSTONE/Fase_2/Evidencias_Grupales/Informe_Avance_AloApp.pdf (por subir)]</w:t>
+              </w:rPr>
+              <w:t xml:space="preserve">CAPSTONE/Fase_2/Evidencias_Grupales/Informe_Avance_AloApp.pdf</w:t>
             </w:r>
           </w:p>
         </w:tc>
@@ -5143,9 +5133,8 @@
             <w:r>
               <w:rPr>
                 <w:sz w:val="20"/>
-                <w:highlight w:val="yellow"/>
-              </w:rPr>
-              <w:t>[docs/plan_trabajo.xlsx (por crear)]</w:t>
+              </w:rPr>
+              <w:t xml:space="preserve">docs/plan_trabajo.xlsx (planificación; ver también la Carta Gantt en CAPSTONE/Fase_1)</w:t>
             </w:r>
           </w:p>
         </w:tc>
@@ -5244,9 +5233,8 @@
             <w:r>
               <w:rPr>
                 <w:sz w:val="20"/>
-                <w:highlight w:val="yellow"/>
-              </w:rPr>
-              <w:t>[docs/pruebas/ (por crear)]</w:t>
+              </w:rPr>
+              <w:t xml:space="preserve">docs/pruebas/ (capturas y evidencias de pruebas)</w:t>
             </w:r>
           </w:p>
         </w:tc>
@@ -5342,9 +5330,8 @@
             <w:r>
               <w:rPr>
                 <w:sz w:val="20"/>
-                <w:highlight w:val="yellow"/>
-              </w:rPr>
-              <w:t>[docs/aportes.md (por crear)]</w:t>
+              </w:rPr>
+              <w:t xml:space="preserve">docs/aportes.md (registro de aportes por integrante)</w:t>
             </w:r>
           </w:p>
         </w:tc>

</xml_diff>